<commit_message>
Update the README and user guide for folder import, the demo project and workspace deletion
The guide now covers folder import of Markdown, text, Word and PDF notes, lists the unsupported formats and what to do about them, adds a section on deleting a workspace, and uses 0.1.1 installer names. The README quick start points at the demo project, and its limits name CSV and OneNote. The guide generator moved into scripts/make_user_guide.py so the document can be regenerated.

Co-Authored-By: Claude Sonnet 5 <noreply@anthropic.com>
</commit_message>
<xml_diff>
--- a/docs/Threadwell-User-Guide.docx
+++ b/docs/Threadwell-User-Guide.docx
@@ -26,7 +26,7 @@
           <w:b w:val="0"/>
           <w:i w:val="0"/>
         </w:rPr>
-        <w:t>Version 0.1.0 for Windows 11. Covers notes, tasks, search, import and export, backup, the local assistant, meetings, and recipes.</w:t>
+        <w:t>Version 0.1.1 for Windows 11. Covers notes, tasks, search, import and export, backup, the local assistant, meetings, and recipes.</w:t>
       </w:r>
     </w:p>
     <w:p>
@@ -101,7 +101,7 @@
         <w:pStyle w:val="ListNumber"/>
       </w:pPr>
       <w:r>
-        <w:t>Open the installer you were given: Threadwell_0.1.0_x64_en-US.msi (Windows Installer) or Threadwell_0.1.0_x64-setup.exe.</w:t>
+        <w:t>Open the installer you were given: Threadwell_0.1.1_x64_en-US.msi (Windows Installer) or Threadwell_0.1.1_x64-setup.exe.</w:t>
       </w:r>
     </w:p>
     <w:p>
@@ -706,7 +706,7 @@
         <w:pStyle w:val="Heading2"/>
       </w:pPr>
       <w:r>
-        <w:t>Import a Markdown file</w:t>
+        <w:t>Import a single file</w:t>
       </w:r>
     </w:p>
     <w:p>
@@ -715,7 +715,7 @@
           <w:b w:val="0"/>
           <w:i w:val="0"/>
         </w:rPr>
-        <w:t>Import copies a Markdown or plain-text file into your workspace. The original file is not changed. A first line starting with a single # becomes the page title.</w:t>
+        <w:t>Import copies one Markdown or plain-text file into your workspace. The original file is not changed. A first line starting with a single # becomes the page title.</w:t>
       </w:r>
     </w:p>
     <w:p>
@@ -740,6 +740,81 @@
       </w:pPr>
       <w:r>
         <w:t>The new page opens. Try it with the sample file samples\import-project-plan.md from the Threadwell folder.</w:t>
+      </w:r>
+    </w:p>
+    <w:p>
+      <w:pPr>
+        <w:pStyle w:val="Heading2"/>
+      </w:pPr>
+      <w:r>
+        <w:t>Import a folder of notes</w:t>
+      </w:r>
+    </w:p>
+    <w:p>
+      <w:r>
+        <w:rPr>
+          <w:b w:val="0"/>
+          <w:i w:val="0"/>
+        </w:rPr>
+        <w:t>Use this to bring in a whole folder at once. It reads Markdown (.md), text (.txt), Word (.docx) and text-based PDF (.pdf) files, one note per file. Your files are never changed, moved or renamed.</w:t>
+      </w:r>
+    </w:p>
+    <w:p>
+      <w:pPr>
+        <w:pStyle w:val="ListNumber"/>
+      </w:pPr>
+      <w:r>
+        <w:t>Open Settings and find Import a folder of notes.</w:t>
+      </w:r>
+    </w:p>
+    <w:p>
+      <w:pPr>
+        <w:pStyle w:val="ListNumber"/>
+      </w:pPr>
+      <w:r>
+        <w:t>Click Choose folder… and select the folder. Threadwell scans it, including subfolders. Hidden files and links are skipped.</w:t>
+      </w:r>
+    </w:p>
+    <w:p>
+      <w:pPr>
+        <w:pStyle w:val="ListNumber"/>
+      </w:pPr>
+      <w:r>
+        <w:t>Read the status column. New means not imported yet. Already imported (unchanged) files are skipped. Changed since import files are imported again as a new page, and the earlier page is kept.</w:t>
+      </w:r>
+    </w:p>
+    <w:p>
+      <w:pPr>
+        <w:pStyle w:val="ListNumber"/>
+      </w:pPr>
+      <w:r>
+        <w:t>Tick the files you want, or click Select all importable.</w:t>
+      </w:r>
+    </w:p>
+    <w:p>
+      <w:pPr>
+        <w:pStyle w:val="ListNumber"/>
+      </w:pPr>
+      <w:r>
+        <w:t>Click Import, then read the summary. It lists imported and skipped counts, and any file that failed with the reason.</w:t>
+      </w:r>
+    </w:p>
+    <w:p>
+      <w:r>
+        <w:rPr>
+          <w:i/>
+          <w:color w:val="555555"/>
+        </w:rPr>
+        <w:t>Note: Word files keep their headings, lists and tables, but not fonts or images. PDFs keep their text but not their layout. Scanned PDFs have no text and cannot be imported. OneNote (.one) and CSV files are not supported yet. Export them from their own program as Markdown, text, Word or PDF first.</w:t>
+      </w:r>
+    </w:p>
+    <w:p>
+      <w:r>
+        <w:rPr>
+          <w:i/>
+          <w:color w:val="555555"/>
+        </w:rPr>
+        <w:t>Note: Transcripts (.vtt and .srt) are not part of folder import. Import them through Meetings instead (section 11).</w:t>
       </w:r>
     </w:p>
     <w:p>
@@ -1716,6 +1791,72 @@
           </w:tcPr>
           <w:p>
             <w:r>
+              <w:t>Folder import says Not supported</w:t>
+            </w:r>
+          </w:p>
+        </w:tc>
+        <w:tc>
+          <w:tcPr>
+            <w:tcW w:type="dxa" w:w="5669"/>
+          </w:tcPr>
+          <w:p>
+            <w:r>
+              <w:t>The file type is .one (OneNote), .doc, .enex or CSV. Export it as Markdown, text, Word or PDF first.</w:t>
+            </w:r>
+          </w:p>
+        </w:tc>
+      </w:tr>
+      <w:tr>
+        <w:tc>
+          <w:tcPr>
+            <w:tcW w:type="dxa" w:w="3402"/>
+          </w:tcPr>
+          <w:p>
+            <w:r>
+              <w:t>Folder import says the PDF has no text layer</w:t>
+            </w:r>
+          </w:p>
+        </w:tc>
+        <w:tc>
+          <w:tcPr>
+            <w:tcW w:type="dxa" w:w="5669"/>
+          </w:tcPr>
+          <w:p>
+            <w:r>
+              <w:t>The PDF is a scan. Use an OCR tool to make a text PDF, then import it again.</w:t>
+            </w:r>
+          </w:p>
+        </w:tc>
+      </w:tr>
+      <w:tr>
+        <w:tc>
+          <w:tcPr>
+            <w:tcW w:type="dxa" w:w="3402"/>
+          </w:tcPr>
+          <w:p>
+            <w:r>
+              <w:t>Folder import shows Changed since import</w:t>
+            </w:r>
+          </w:p>
+        </w:tc>
+        <w:tc>
+          <w:tcPr>
+            <w:tcW w:type="dxa" w:w="5669"/>
+          </w:tcPr>
+          <w:p>
+            <w:r>
+              <w:t>The file changed after its last import. Importing it again creates a new page; the earlier page stays.</w:t>
+            </w:r>
+          </w:p>
+        </w:tc>
+      </w:tr>
+      <w:tr>
+        <w:tc>
+          <w:tcPr>
+            <w:tcW w:type="dxa" w:w="3402"/>
+          </w:tcPr>
+          <w:p>
+            <w:r>
               <w:t>Import audio… explains an engine is needed</w:t>
             </w:r>
           </w:p>
@@ -1763,6 +1904,64 @@
       </w:pPr>
       <w:r>
         <w:t>Threadwell keeps only one small file outside your workspace: it remembers which workspace to reopen.</w:t>
+      </w:r>
+    </w:p>
+    <w:p>
+      <w:pPr>
+        <w:pStyle w:val="Heading1"/>
+      </w:pPr>
+      <w:r>
+        <w:t>15. Delete a workspace</w:t>
+      </w:r>
+    </w:p>
+    <w:p>
+      <w:r>
+        <w:rPr>
+          <w:b w:val="0"/>
+          <w:i w:val="0"/>
+        </w:rPr>
+        <w:t>Threadwell has no delete button for workspaces. A workspace is a folder, so you delete the folder. This is permanent.</w:t>
+      </w:r>
+    </w:p>
+    <w:p>
+      <w:pPr>
+        <w:pStyle w:val="ListNumber"/>
+      </w:pPr>
+      <w:r>
+        <w:t>Close Threadwell completely, including from the system tray.</w:t>
+      </w:r>
+    </w:p>
+    <w:p>
+      <w:pPr>
+        <w:pStyle w:val="ListNumber"/>
+      </w:pPr>
+      <w:r>
+        <w:t>Back up first if you might need the data later: open the workspace, then Settings → Create backup.</w:t>
+      </w:r>
+    </w:p>
+    <w:p>
+      <w:pPr>
+        <w:pStyle w:val="ListNumber"/>
+      </w:pPr>
+      <w:r>
+        <w:t>In File Explorer, delete the workspace folder. It holds threadwell.db, the -wal and -shm files beside it, and an attachments folder. Deleting the folder removes everything.</w:t>
+      </w:r>
+    </w:p>
+    <w:p>
+      <w:pPr>
+        <w:pStyle w:val="ListNumber"/>
+      </w:pPr>
+      <w:r>
+        <w:t>Optional: delete %APPDATA%\dev.threadwell.app\last-workspace.txt. Threadwell remembers the last workspace there. If the folder is gone, the app shows the first-run screen anyway.</w:t>
+      </w:r>
+    </w:p>
+    <w:p>
+      <w:r>
+        <w:rPr>
+          <w:i/>
+          <w:color w:val="555555"/>
+        </w:rPr>
+        <w:t>Note: Uninstalling Threadwell does not delete workspaces, because they live outside the program folder.</w:t>
       </w:r>
     </w:p>
     <w:p>

</xml_diff>

<commit_message>
Release 0.1.2: attachments, CSV, folder sync, audio, selected-text context, faster saves
Adds attachments stored in the workspace, CSV import as tables, watched folders with a manual sync, audio transcription through a local engine the user installs, conversation search, selected text as assistant context, board drag and drop, delete run trace, and a distinct disk-full state.

Performance: deleting search rows by rowid fixes a quadratic scan. Bulk creation of 5,000 pages drops from about 190 s to 34 s. The main JavaScript bundle is lazy-split and falls from 725 kB to 238 kB.

Assistant: a new held-out split (heldout2) with qwen2.5:7b passes seven of eight gated checks, including both injection checks. Task keyword recall fails at 0.50 and is reported as failed.

Idle memory is 372 MiB, higher than before and above the 250 MiB target. Reported as not met.

Co-Authored-By: Claude Sonnet 5 <noreply@anthropic.com>
</commit_message>
<xml_diff>
--- a/docs/Threadwell-User-Guide.docx
+++ b/docs/Threadwell-User-Guide.docx
@@ -26,7 +26,7 @@
           <w:b w:val="0"/>
           <w:i w:val="0"/>
         </w:rPr>
-        <w:t>Version 0.1.1 for Windows 11. Covers notes, tasks, search, import and export, backup, the local assistant, meetings, and recipes.</w:t>
+        <w:t>Version 0.1.2 for Windows 11. Covers notes, tasks, search, import and export, backup, the local assistant, meetings, and recipes.</w:t>
       </w:r>
     </w:p>
     <w:p>
@@ -101,7 +101,7 @@
         <w:pStyle w:val="ListNumber"/>
       </w:pPr>
       <w:r>
-        <w:t>Open the installer you were given: Threadwell_0.1.1_x64_en-US.msi (Windows Installer) or Threadwell_0.1.1_x64-setup.exe.</w:t>
+        <w:t>Open the installer you were given: Threadwell_0.1.2_x64_en-US.msi (Windows Installer) or Threadwell_0.1.2_x64-setup.exe.</w:t>
       </w:r>
     </w:p>
     <w:p>
@@ -584,6 +584,56 @@
         <w:pStyle w:val="Heading2"/>
       </w:pPr>
       <w:r>
+        <w:t>Attach a file to a page</w:t>
+      </w:r>
+    </w:p>
+    <w:p>
+      <w:r>
+        <w:rPr>
+          <w:b w:val="0"/>
+          <w:i w:val="0"/>
+        </w:rPr>
+        <w:t>Attachments are copies stored inside your workspace. Your original file is not moved or changed.</w:t>
+      </w:r>
+    </w:p>
+    <w:p>
+      <w:pPr>
+        <w:pStyle w:val="ListNumber"/>
+      </w:pPr>
+      <w:r>
+        <w:t>Open the page and scroll to the Attachments section below the editor.</w:t>
+      </w:r>
+    </w:p>
+    <w:p>
+      <w:pPr>
+        <w:pStyle w:val="ListNumber"/>
+      </w:pPr>
+      <w:r>
+        <w:t>Click Attach a file… and choose the file. Files up to 25 MB are accepted.</w:t>
+      </w:r>
+    </w:p>
+    <w:p>
+      <w:pPr>
+        <w:pStyle w:val="ListNumber"/>
+      </w:pPr>
+      <w:r>
+        <w:t>To see where the stored copy is, click Show in folder. To delete the copy, click Remove. Your original file is not touched.</w:t>
+      </w:r>
+    </w:p>
+    <w:p>
+      <w:r>
+        <w:rPr>
+          <w:i/>
+          <w:color w:val="555555"/>
+        </w:rPr>
+        <w:t>Note: Programs and scripts (.exe, .bat, .ps1, .js, .msi and similar) cannot be attached. Attach a document or export the data instead.</w:t>
+      </w:r>
+    </w:p>
+    <w:p>
+      <w:pPr>
+        <w:pStyle w:val="Heading2"/>
+      </w:pPr>
+      <w:r>
         <w:t>Move a page to the trash</w:t>
       </w:r>
     </w:p>
@@ -649,7 +699,7 @@
         <w:pStyle w:val="ListNumber"/>
       </w:pPr>
       <w:r>
-        <w:t>Use Board to see three columns: To do, In progress and Done. Use ← and → on a card to move it.</w:t>
+        <w:t>Use Board to see three columns: To do, In progress and Done. Drag a card to another column, or use ← and → on the card.</w:t>
       </w:r>
     </w:p>
     <w:p>
@@ -780,6 +830,14 @@
         <w:pStyle w:val="ListNumber"/>
       </w:pPr>
       <w:r>
+        <w:t>Optional: click Watch this folder. Later, Sync watched folders now imports any new notes in it. Changed files are reported, not imported automatically, so no duplicate pages appear.</w:t>
+      </w:r>
+    </w:p>
+    <w:p>
+      <w:pPr>
+        <w:pStyle w:val="ListNumber"/>
+      </w:pPr>
+      <w:r>
         <w:t>Read the status column. New means not imported yet. Already imported (unchanged) files are skipped. Changed since import files are imported again as a new page, and the earlier page is kept.</w:t>
       </w:r>
     </w:p>
@@ -805,7 +863,7 @@
           <w:i/>
           <w:color w:val="555555"/>
         </w:rPr>
-        <w:t>Note: Word files keep their headings, lists and tables, but not fonts or images. PDFs keep their text but not their layout. Scanned PDFs have no text and cannot be imported. OneNote (.one) and CSV files are not supported yet. Export them from their own program as Markdown, text, Word or PDF first.</w:t>
+        <w:t>Note: Word files keep their headings, lists and tables, but not fonts or images. PDFs keep their text but not their layout. Scanned PDFs have no text and cannot be imported. CSV files become tables. OneNote (.one) files are not supported; export them from OneNote as Word or Markdown first.</w:t>
       </w:r>
     </w:p>
     <w:p>
@@ -961,6 +1019,14 @@
       </w:pPr>
       <w:r>
         <w:t>AI assistance → Model server address, Model name, and an option to allow a server on another machine. Leave the last option off unless you know you need it.</w:t>
+      </w:r>
+    </w:p>
+    <w:p>
+      <w:pPr>
+        <w:pStyle w:val="ListBullet"/>
+      </w:pPr>
+      <w:r>
+        <w:t>Audio transcription (local engine) → the engine program and the model file you installed yourself. See section 11.</w:t>
       </w:r>
     </w:p>
     <w:p>
@@ -1357,6 +1423,40 @@
         <w:pStyle w:val="Heading2"/>
       </w:pPr>
       <w:r>
+        <w:t>Use selected text as context</w:t>
+      </w:r>
+    </w:p>
+    <w:p>
+      <w:r>
+        <w:rPr>
+          <w:b w:val="0"/>
+          <w:i w:val="0"/>
+        </w:rPr>
+        <w:t>Select a passage in a page. A box appears in the assistant panel: Include the selected text as context. Tick it to include the passage with your question. Untick it to ask without it.</w:t>
+      </w:r>
+    </w:p>
+    <w:p>
+      <w:pPr>
+        <w:pStyle w:val="Heading2"/>
+      </w:pPr>
+      <w:r>
+        <w:t>Find a past conversation</w:t>
+      </w:r>
+    </w:p>
+    <w:p>
+      <w:r>
+        <w:rPr>
+          <w:b w:val="0"/>
+          <w:i w:val="0"/>
+        </w:rPr>
+        <w:t>Type in Search past conversations at the top of the assistant panel. Matching conversations appear with the matching text. Click one to open it.</w:t>
+      </w:r>
+    </w:p>
+    <w:p>
+      <w:pPr>
+        <w:pStyle w:val="Heading2"/>
+      </w:pPr>
+      <w:r>
         <w:t>Keep a page out of the assistant</w:t>
       </w:r>
     </w:p>
@@ -1383,7 +1483,7 @@
           <w:b w:val="0"/>
           <w:i w:val="0"/>
         </w:rPr>
-        <w:t>Settings → Assistant history lists recent runs with their status, time and token counts. Click a time to see each tool call and its outcome. Model reasoning is not stored.</w:t>
+        <w:t>Settings → Assistant history lists recent runs with their status, time and token counts. Click a time to see each tool call and its outcome, and Delete this run's trace to remove that trace. Suggestions and pages are kept. Model reasoning is not stored.</w:t>
       </w:r>
     </w:p>
     <w:p>
@@ -1440,15 +1540,64 @@
       </w:pPr>
       <w:r>
         <w:t>Review the action items card. Click Apply to create the tasks, or Reject. A due date appears only if the transcript states that exact date.</w:t>
+      </w:r>
+    </w:p>
+    <w:p>
+      <w:pPr>
+        <w:pStyle w:val="Heading2"/>
+      </w:pPr>
+      <w:r>
+        <w:t>Audio recordings (optional)</w:t>
       </w:r>
     </w:p>
     <w:p>
       <w:r>
         <w:rPr>
           <w:b w:val="0"/>
+          <w:i w:val="0"/>
+        </w:rPr>
+        <w:t>Threadwell can turn a recording into a transcript with a local engine you install yourself, such as whisper.cpp (its whisper-cli program) and a model file you download for it. Threadwell does not download either one.</w:t>
+      </w:r>
+    </w:p>
+    <w:p>
+      <w:pPr>
+        <w:pStyle w:val="ListNumber"/>
+      </w:pPr>
+      <w:r>
+        <w:t>Install the engine and download a model file, following the engine's own instructions.</w:t>
+      </w:r>
+    </w:p>
+    <w:p>
+      <w:pPr>
+        <w:pStyle w:val="ListNumber"/>
+      </w:pPr>
+      <w:r>
+        <w:t>In Settings → Audio transcription, choose the engine program and the model file, then click Save.</w:t>
+      </w:r>
+    </w:p>
+    <w:p>
+      <w:pPr>
+        <w:pStyle w:val="ListNumber"/>
+      </w:pPr>
+      <w:r>
+        <w:t>In Meetings, click Import audio… and choose a WAV, MP3, M4A, MP4, WebM, FLAC or OGG recording.</w:t>
+      </w:r>
+    </w:p>
+    <w:p>
+      <w:pPr>
+        <w:pStyle w:val="ListNumber"/>
+      </w:pPr>
+      <w:r>
+        <w:t>The transcript is imported as a meeting. A transcription can take a long time; it stops after 30 minutes.</w:t>
+      </w:r>
+    </w:p>
+    <w:p>
+      <w:r>
+        <w:rPr>
           <w:i/>
+          <w:color w:val="555555"/>
         </w:rPr>
-        <w:t>Audio recordings are not supported yet. Import audio… tells you that a transcription engine is needed. Convert the recording to text first, then import the text.</w:t>
+        <w:t>Note: Without an engine, Import audio… explains what is needed. You can always import a text transcript instead. Recording-to-text quality depends on the engine and model you choose.</w:t>
       </w:r>
     </w:p>
     <w:p>
@@ -1801,7 +1950,7 @@
           </w:tcPr>
           <w:p>
             <w:r>
-              <w:t>The file type is .one (OneNote), .doc, .enex or CSV. Export it as Markdown, text, Word or PDF first.</w:t>
+              <w:t>The file type is .one (OneNote), .doc or .enex. Export it as Markdown, text, Word, PDF or CSV first.</w:t>
             </w:r>
           </w:p>
         </w:tc>
@@ -1867,7 +2016,51 @@
           </w:tcPr>
           <w:p>
             <w:r>
-              <w:t>Audio is not supported in this version. Convert it to a transcript first.</w:t>
+              <w:t>Choose an engine program and a model file in Settings → Audio transcription, or import a text transcript instead.</w:t>
+            </w:r>
+          </w:p>
+        </w:tc>
+      </w:tr>
+      <w:tr>
+        <w:tc>
+          <w:tcPr>
+            <w:tcW w:type="dxa" w:w="3402"/>
+          </w:tcPr>
+          <w:p>
+            <w:r>
+              <w:t>Attach a file says it cannot be attached</w:t>
+            </w:r>
+          </w:p>
+        </w:tc>
+        <w:tc>
+          <w:tcPr>
+            <w:tcW w:type="dxa" w:w="5669"/>
+          </w:tcPr>
+          <w:p>
+            <w:r>
+              <w:t>The file is a program or script, or it is larger than 25 MB.</w:t>
+            </w:r>
+          </w:p>
+        </w:tc>
+      </w:tr>
+      <w:tr>
+        <w:tc>
+          <w:tcPr>
+            <w:tcW w:type="dxa" w:w="3402"/>
+          </w:tcPr>
+          <w:p>
+            <w:r>
+              <w:t>The disk is full message</w:t>
+            </w:r>
+          </w:p>
+        </w:tc>
+        <w:tc>
+          <w:tcPr>
+            <w:tcW w:type="dxa" w:w="5669"/>
+          </w:tcPr>
+          <w:p>
+            <w:r>
+              <w:t>Free some disk space. Threadwell keeps your edits open; save again after freeing space.</w:t>
             </w:r>
           </w:p>
         </w:tc>

</xml_diff>

<commit_message>
Release 0.1.3: OpenTelemetry local traces and the multi-agent option
Version 0.1.3. Adds optional local OpenTelemetry traces (off by default, no content recorded), a graph of roles with per-role tool allowlists as an experimental alternative to the single agent, and an architecture setting that keeps the single agent as the default. The documentation and user guide describe both, and the comparison result is recorded.

Co-Authored-By: Claude Sonnet 5 <noreply@anthropic.com>
</commit_message>
<xml_diff>
--- a/docs/Threadwell-User-Guide.docx
+++ b/docs/Threadwell-User-Guide.docx
@@ -26,7 +26,7 @@
           <w:b w:val="0"/>
           <w:i w:val="0"/>
         </w:rPr>
-        <w:t>Version 0.1.2 for Windows 11. Covers notes, tasks, search, import and export, backup, the local assistant, meetings, and recipes.</w:t>
+        <w:t>Version 0.1.3 for Windows 11. Covers notes, tasks, search, import and export, backup, the local assistant, meetings, and recipes.</w:t>
       </w:r>
     </w:p>
     <w:p>
@@ -101,7 +101,7 @@
         <w:pStyle w:val="ListNumber"/>
       </w:pPr>
       <w:r>
-        <w:t>Open the installer you were given: Threadwell_0.1.2_x64_en-US.msi (Windows Installer) or Threadwell_0.1.2_x64-setup.exe.</w:t>
+        <w:t>Open the installer you were given: Threadwell_0.1.3_x64_en-US.msi (Windows Installer) or Threadwell_0.1.3_x64-setup.exe.</w:t>
       </w:r>
     </w:p>
     <w:p>
@@ -1598,6 +1598,32 @@
           <w:color w:val="555555"/>
         </w:rPr>
         <w:t>Note: Without an engine, Import audio… explains what is needed. You can always import a text transcript instead. Recording-to-text quality depends on the engine and model you choose.</w:t>
+      </w:r>
+    </w:p>
+    <w:p>
+      <w:pPr>
+        <w:pStyle w:val="Heading2"/>
+      </w:pPr>
+      <w:r>
+        <w:t>Agent design and local performance traces (optional)</w:t>
+      </w:r>
+    </w:p>
+    <w:p>
+      <w:r>
+        <w:rPr>
+          <w:b w:val="0"/>
+          <w:i w:val="0"/>
+        </w:rPr>
+        <w:t>Settings → Finding information → Agent design chooses how the assistant works. One agent is the default and is the one we recommend. Several agents splits each question into planning, research, writing and an optional action step. In our own tests it was slower and did not answer better, so treat it as experimental.</w:t>
+      </w:r>
+    </w:p>
+    <w:p>
+      <w:r>
+        <w:rPr>
+          <w:b w:val="0"/>
+          <w:i w:val="0"/>
+        </w:rPr>
+        <w:t>Settings → Performance traces (local only) can record timing for assistant runs in a file on your computer, in OpenTelemetry format. Traces never include prompts, answers, page text or search results. Nothing is sent anywhere. The setting takes effect the next time you start Threadwell. Delete traces removes the file.</w:t>
       </w:r>
     </w:p>
     <w:p>

</xml_diff>

<commit_message>
Release 0.1.4: document workspaces and the heldout4 result
Updates the intent brief, README, status, architecture, acceptance checks,
and the Word user guide for workspaces, scoped assistant retrieval, the
opt-in traces, and the heldout4 result. Bumps the version to 0.1.4.

Co-Authored-By: Claude Sonnet 5 <noreply@anthropic.com>
</commit_message>
<xml_diff>
--- a/docs/Threadwell-User-Guide.docx
+++ b/docs/Threadwell-User-Guide.docx
@@ -26,7 +26,7 @@
           <w:b w:val="0"/>
           <w:i w:val="0"/>
         </w:rPr>
-        <w:t>Version 0.1.3 for Windows 11. Covers notes, tasks, search, import and export, backup, the local assistant, meetings, and recipes.</w:t>
+        <w:t>Version 0.1.4 for Windows 11. Covers notes, tasks, search, import and export, backup, the local assistant, meetings, recipes, and several workspaces.</w:t>
       </w:r>
     </w:p>
     <w:p>
@@ -101,7 +101,7 @@
         <w:pStyle w:val="ListNumber"/>
       </w:pPr>
       <w:r>
-        <w:t>Open the installer you were given: Threadwell_0.1.3_x64_en-US.msi (Windows Installer) or Threadwell_0.1.3_x64-setup.exe.</w:t>
+        <w:t>Open the installer you were given: Threadwell_0.1.4_x64_en-US.msi (Windows Installer) or Threadwell_0.1.4_x64-setup.exe.</w:t>
       </w:r>
     </w:p>
     <w:p>
@@ -1614,7 +1614,7 @@
           <w:b w:val="0"/>
           <w:i w:val="0"/>
         </w:rPr>
-        <w:t>Settings → Finding information → Agent design chooses how the assistant works. One agent is the default and is the one we recommend. Several agents splits each question into planning, research, writing and an optional action step. In our own tests it was slower and did not answer better, so treat it as experimental.</w:t>
+        <w:t>Settings → Finding information → Agent design chooses how the assistant works. One agent is the default and is the one we recommend. Several agents splits each question into planning, research, writing and an optional action step. On our fourth test set it was slower and gave worse answers on most measures, though it refused injected instructions better. Keep one agent unless you want to try the other on your own notes.</w:t>
       </w:r>
     </w:p>
     <w:p>
@@ -1697,7 +1697,81 @@
         <w:pStyle w:val="Heading1"/>
       </w:pPr>
       <w:r>
-        <w:t>13. Troubleshooting</w:t>
+        <w:t>13. Work with several workspaces</w:t>
+      </w:r>
+    </w:p>
+    <w:p>
+      <w:r>
+        <w:rPr>
+          <w:b w:val="0"/>
+          <w:i w:val="0"/>
+        </w:rPr>
+        <w:t>Use one workspace per area of your life or work. Each workspace has its own pages, tasks, meetings, recipes and assistant history, and pages never move between them. The assistant can also answer from other workspaces.</w:t>
+      </w:r>
+    </w:p>
+    <w:p>
+      <w:pPr>
+        <w:pStyle w:val="ListNumber"/>
+      </w:pPr>
+      <w:r>
+        <w:t>Open Settings and find the Workspaces section. Your known workspaces are listed, and the open one is marked.</w:t>
+      </w:r>
+    </w:p>
+    <w:p>
+      <w:pPr>
+        <w:pStyle w:val="ListNumber"/>
+      </w:pPr>
+      <w:r>
+        <w:t>To add one, click Create or open another workspace. Create a new workspace in an empty folder, or open an existing one.</w:t>
+      </w:r>
+    </w:p>
+    <w:p>
+      <w:pPr>
+        <w:pStyle w:val="ListNumber"/>
+      </w:pPr>
+      <w:r>
+        <w:t>To change workspace, click Switch on the one you want. Anything it was doing in the previous workspace is stopped first.</w:t>
+      </w:r>
+    </w:p>
+    <w:p>
+      <w:pPr>
+        <w:pStyle w:val="ListNumber"/>
+      </w:pPr>
+      <w:r>
+        <w:t>To rename the open workspace, type a name under Rename the open workspace and click Rename.</w:t>
+      </w:r>
+    </w:p>
+    <w:p>
+      <w:pPr>
+        <w:pStyle w:val="ListNumber"/>
+      </w:pPr>
+      <w:r>
+        <w:t>To take a workspace off the list, click Remove from list. Its folder and pages are kept, and you can open it again later.</w:t>
+      </w:r>
+    </w:p>
+    <w:p>
+      <w:pPr>
+        <w:pStyle w:val="Heading2"/>
+      </w:pPr>
+      <w:r>
+        <w:t>Ask the assistant about other workspaces</w:t>
+      </w:r>
+    </w:p>
+    <w:p>
+      <w:r>
+        <w:rPr>
+          <w:b w:val="0"/>
+          <w:i w:val="0"/>
+        </w:rPr>
+        <w:t>Above the message box, the Answer from list has three kinds of choice. This workspace only is the default. All workspaces searches every workspace. A workspace name searches only that one. Other workspaces are read-only for the assistant. It never changes them, and proposed changes always go to the open workspace only. You can also name a workspace in your question, for example: What is in my Home workspace?</w:t>
+      </w:r>
+    </w:p>
+    <w:p>
+      <w:pPr>
+        <w:pStyle w:val="Heading1"/>
+      </w:pPr>
+      <w:r>
+        <w:t>14. Troubleshooting</w:t>
       </w:r>
     </w:p>
     <w:tbl>
@@ -2098,7 +2172,7 @@
         <w:pStyle w:val="Heading1"/>
       </w:pPr>
       <w:r>
-        <w:t>14. Where your data lives</w:t>
+        <w:t>15. Where your data lives</w:t>
       </w:r>
     </w:p>
     <w:p>
@@ -2130,7 +2204,7 @@
         <w:pStyle w:val="Heading1"/>
       </w:pPr>
       <w:r>
-        <w:t>15. Delete a workspace</w:t>
+        <w:t>16. Delete a workspace</w:t>
       </w:r>
     </w:p>
     <w:p>
@@ -2171,7 +2245,7 @@
         <w:pStyle w:val="ListNumber"/>
       </w:pPr>
       <w:r>
-        <w:t>Optional: delete %APPDATA%\dev.threadwell.app\last-workspace.txt. Threadwell remembers the last workspace there. If the folder is gone, the app shows the first-run screen anyway.</w:t>
+        <w:t>Optional: in Settings → Workspaces, click Remove from list. This clears the entry from %APPDATA%\dev.threadwell.app\workspaces.json. If the folder is gone, the app shows the first-run screen anyway.</w:t>
       </w:r>
     </w:p>
     <w:p>

</xml_diff>

<commit_message>
Document linked folders and publish the video guides
Updates the brief, README, status, architecture, acceptance checks and the
Word user guide for linked folders. Adds three MP4 video guides recorded
from the running app, with a step list in docs/videos/README.md. The
recordings use a sample workspace with sample content only, and the
README says which steps were shortened.

Co-Authored-By: Claude Sonnet 5 <noreply@anthropic.com>
</commit_message>
<xml_diff>
--- a/docs/Threadwell-User-Guide.docx
+++ b/docs/Threadwell-User-Guide.docx
@@ -26,7 +26,7 @@
           <w:b w:val="0"/>
           <w:i w:val="0"/>
         </w:rPr>
-        <w:t>Version 0.1.4 for Windows 11. Covers notes, tasks, search, import and export, backup, the local assistant, meetings, recipes, and several workspaces.</w:t>
+        <w:t>Version 0.1.4 for Windows 11. Covers notes, tasks, search, import and export, backup, the local assistant, meetings, recipes, several workspaces, and linked project folders.</w:t>
       </w:r>
     </w:p>
     <w:p>
@@ -1722,6 +1722,14 @@
         <w:pStyle w:val="ListNumber"/>
       </w:pPr>
       <w:r>
+        <w:t>In the sidebar, the Workspaces section lists the pages of each workspace. Pages of other workspaces are read only. Clicking one switches to that workspace and opens the page.</w:t>
+      </w:r>
+    </w:p>
+    <w:p>
+      <w:pPr>
+        <w:pStyle w:val="ListNumber"/>
+      </w:pPr>
+      <w:r>
         <w:t>To add one, click Create or open another workspace. Create a new workspace in an empty folder, or open an existing one.</w:t>
       </w:r>
     </w:p>
@@ -1771,7 +1779,89 @@
         <w:pStyle w:val="Heading1"/>
       </w:pPr>
       <w:r>
-        <w:t>14. Troubleshooting</w:t>
+        <w:t>14. Link a folder and ask about it</w:t>
+      </w:r>
+    </w:p>
+    <w:p>
+      <w:r>
+        <w:rPr>
+          <w:b w:val="0"/>
+          <w:i w:val="0"/>
+        </w:rPr>
+        <w:t>Link a project folder, such as software source code, or a folder of documents. Threadwell reads the files, keeps them in step while the app is open, and the assistant answers questions about them. Each answer names the file it came from. Your folder is never changed.</w:t>
+      </w:r>
+    </w:p>
+    <w:p>
+      <w:pPr>
+        <w:pStyle w:val="ListNumber"/>
+      </w:pPr>
+      <w:r>
+        <w:t>Click Sources in the sidebar, then Link a folder. Choose the folder.</w:t>
+      </w:r>
+    </w:p>
+    <w:p>
+      <w:pPr>
+        <w:pStyle w:val="ListNumber"/>
+      </w:pPr>
+      <w:r>
+        <w:t>Threadwell reads the files. Each one appears as a read-only page titled with its path, such as src/charge.rs.</w:t>
+      </w:r>
+    </w:p>
+    <w:p>
+      <w:pPr>
+        <w:pStyle w:val="ListNumber"/>
+      </w:pPr>
+      <w:r>
+        <w:t>Source code, configuration, Markdown, text, Word, text-based PDF and CSV files are read. Build output, dependencies, hidden files, lock files and anything in the folder's .gitignore are skipped.</w:t>
+      </w:r>
+    </w:p>
+    <w:p>
+      <w:pPr>
+        <w:pStyle w:val="ListNumber"/>
+      </w:pPr>
+      <w:r>
+        <w:t>Click Show files to open a linked file. It is read only.</w:t>
+      </w:r>
+    </w:p>
+    <w:p>
+      <w:pPr>
+        <w:pStyle w:val="ListNumber"/>
+      </w:pPr>
+      <w:r>
+        <w:t>Ask the assistant a question about the project. Click a source to open that file.</w:t>
+      </w:r>
+    </w:p>
+    <w:p>
+      <w:pPr>
+        <w:pStyle w:val="ListNumber"/>
+      </w:pPr>
+      <w:r>
+        <w:t>Click Sync now to check for changes at once. Threadwell also checks about once a minute while it is open.</w:t>
+      </w:r>
+    </w:p>
+    <w:p>
+      <w:pPr>
+        <w:pStyle w:val="ListNumber"/>
+      </w:pPr>
+      <w:r>
+        <w:t>Click Unlink to remove the link. The files move to Trash. The folder is not changed.</w:t>
+      </w:r>
+    </w:p>
+    <w:p>
+      <w:r>
+        <w:rPr>
+          <w:i/>
+          <w:color w:val="555555"/>
+        </w:rPr>
+        <w:t>Note: Limits: 5,000 files per folder. Answers cite the file, not the line numbers. Checks happen only while Threadwell is open. Try the sample project in samples\sample-repo.</w:t>
+      </w:r>
+    </w:p>
+    <w:p>
+      <w:pPr>
+        <w:pStyle w:val="Heading1"/>
+      </w:pPr>
+      <w:r>
+        <w:t>15. Troubleshooting</w:t>
       </w:r>
     </w:p>
     <w:tbl>
@@ -2172,7 +2262,7 @@
         <w:pStyle w:val="Heading1"/>
       </w:pPr>
       <w:r>
-        <w:t>15. Where your data lives</w:t>
+        <w:t>16. Where your data lives</w:t>
       </w:r>
     </w:p>
     <w:p>
@@ -2204,7 +2294,7 @@
         <w:pStyle w:val="Heading1"/>
       </w:pPr>
       <w:r>
-        <w:t>16. Delete a workspace</w:t>
+        <w:t>17. Delete a workspace</w:t>
       </w:r>
     </w:p>
     <w:p>

</xml_diff>

<commit_message>
Document line citations, drops, quick questions and the sample project
Updates the brief, README, status, architecture, acceptance checks and the
Word guide. Removes the statements that citations name only files.

Co-Authored-By: Claude Sonnet 5 <noreply@anthropic.com>
</commit_message>
<xml_diff>
--- a/docs/Threadwell-User-Guide.docx
+++ b/docs/Threadwell-User-Guide.docx
@@ -1828,7 +1828,31 @@
         <w:pStyle w:val="ListNumber"/>
       </w:pPr>
       <w:r>
-        <w:t>Ask the assistant a question about the project. Click a source to open that file.</w:t>
+        <w:t>Ask the assistant a question about the project. For code, the citation names the file and the lines, such as src/charge.rs · Lines 41–80. Click it to see that part of the file.</w:t>
+      </w:r>
+    </w:p>
+    <w:p>
+      <w:pPr>
+        <w:pStyle w:val="ListNumber"/>
+      </w:pPr>
+      <w:r>
+        <w:t>Drop a folder on the Threadwell window to link it, or drop a Markdown or text file to import it as a note.</w:t>
+      </w:r>
+    </w:p>
+    <w:p>
+      <w:pPr>
+        <w:pStyle w:val="ListNumber"/>
+      </w:pPr>
+      <w:r>
+        <w:t>On a linked file, use Summarise this file, List open items or Explain how it works. The question goes into the assistant box, ready to send.</w:t>
+      </w:r>
+    </w:p>
+    <w:p>
+      <w:pPr>
+        <w:pStyle w:val="ListNumber"/>
+      </w:pPr>
+      <w:r>
+        <w:t>New workspace: tick the sample option and the sample project is written to a sample-project folder inside the workspace and linked.</w:t>
       </w:r>
     </w:p>
     <w:p>
@@ -1853,7 +1877,7 @@
           <w:i/>
           <w:color w:val="555555"/>
         </w:rPr>
-        <w:t>Note: Limits: 5,000 files per folder. Answers cite the file, not the line numbers. Checks happen only while Threadwell is open. Try the sample project in samples\sample-repo.</w:t>
+        <w:t>Note: Limits: 5,000 files per folder. For code, answers name the file and the line section, for example Lines 41–80. Checks happen only while Threadwell is open. Try the sample project in samples\sample-repo.</w:t>
       </w:r>
     </w:p>
     <w:p>

</xml_diff>

<commit_message>
Release 0.1.5: line citations for code, drag and drop, quick questions
Co-Authored-By: Claude Sonnet 5 <noreply@anthropic.com>
</commit_message>
<xml_diff>
--- a/docs/Threadwell-User-Guide.docx
+++ b/docs/Threadwell-User-Guide.docx
@@ -26,7 +26,7 @@
           <w:b w:val="0"/>
           <w:i w:val="0"/>
         </w:rPr>
-        <w:t>Version 0.1.4 for Windows 11. Covers notes, tasks, search, import and export, backup, the local assistant, meetings, recipes, several workspaces, and linked project folders.</w:t>
+        <w:t>Version 0.1.5 for Windows 11. Covers notes, tasks, search, import and export, backup, the local assistant, meetings, recipes, several workspaces, and linked project folders.</w:t>
       </w:r>
     </w:p>
     <w:p>
@@ -101,7 +101,7 @@
         <w:pStyle w:val="ListNumber"/>
       </w:pPr>
       <w:r>
-        <w:t>Open the installer you were given: Threadwell_0.1.4_x64_en-US.msi (Windows Installer) or Threadwell_0.1.4_x64-setup.exe.</w:t>
+        <w:t>Open the installer you were given: Threadwell_0.1.5_x64_en-US.msi (Windows Installer) or Threadwell_0.1.5_x64-setup.exe.</w:t>
       </w:r>
     </w:p>
     <w:p>

</xml_diff>

<commit_message>
Read Word, PDF and CSV attachments and single files into searchable notes
Attachments were copied into the workspace but never read, so the assistant
could not answer from an attached Word or PDF file. Attaching a readable file
now also creates a note under its page, and the attach result says whether
the file was read or why it was not.

Single-file import, drag and drop, and the Settings import accepted only
Markdown and text. They now accept the same types as folder import: Word,
PDF, CSV, Markdown and text.

Regression tests use the real sample files: Word and PDF extraction, an
attached Word file becoming searchable, a single Word import, and a linked
folder of documents being searchable.

Documentation recommends the 7B model for document questions. In a live test
the 3B model misstated an attached Word file, and the 7B model answered
correctly.

Co-Authored-By: Claude Sonnet 5 <noreply@anthropic.com>
</commit_message>
<xml_diff>
--- a/docs/Threadwell-User-Guide.docx
+++ b/docs/Threadwell-User-Guide.docx
@@ -593,7 +593,7 @@
           <w:b w:val="0"/>
           <w:i w:val="0"/>
         </w:rPr>
-        <w:t>Attachments are copies stored inside your workspace. Your original file is not moved or changed.</w:t>
+        <w:t>Attachments are copies stored inside your workspace. Your original file is not moved or changed. Word, PDF, CSV, Markdown and text files are also read into a note under the page, so the assistant can answer questions from them.</w:t>
       </w:r>
     </w:p>
     <w:p>
@@ -781,7 +781,7 @@
         <w:pStyle w:val="ListNumber"/>
       </w:pPr>
       <w:r>
-        <w:t>Click Import a Markdown file and choose a .md, .markdown or .txt file. The file must be UTF-8 text under 5 MB.</w:t>
+        <w:t>Click Import a file and choose a Markdown, text, Word, PDF or CSV file. The file must be under 5 MB. Scanned PDFs have no text and cannot be read.</w:t>
       </w:r>
     </w:p>
     <w:p>

</xml_diff>